<commit_message>
Align the Session 01 content-development document with the course as delivered
L&D now uses the repository copy as the single source of truth. The document
describes Session 01 as an instructor demonstration that learners repeat after
class: no pre-work, a 28 October date, GitLab group access instead of a personal
repository, the demo-based agenda, the learner kit instead of the reference
repository, and the check pack and push to GitLab as the expected result.

It also takes the ReAct-first objectives and takeaway, a course-opening first
section (agent teams, when to split work, why a platform), the Session 01 page
as the presentation and asset, and glossary entries for the kit, check pack
and given files. The Markdown twin is regenerated from the .docx by the new
guide-builder/content_md.py.

Co-Authored-By: Claude Opus 5.5 <noreply@anthropic.com>
Claude-Session: https://claude.ai/code/session_0123W63ZaDAAnYHCFqarTnbL
</commit_message>
<xml_diff>
--- a/L3 2026 Agentic Platform Instructor Materials/content-development/01 Agent architecture and the ReAct runtime - content development.docx
+++ b/L3 2026 Agentic Platform Instructor Materials/content-development/01 Agent architecture and the ReAct runtime - content development.docx
@@ -192,7 +192,7 @@
           <w:color w:val="1F4E79"/>
           <w:rtl w:val="0"/>
         </w:rPr>
-        <w:t>This first session of "Building Agentic Platforms" explains how an AI agent actually works: a model proposes an action, a runtime decides whether to execute it, and a tool returns an observation, in a loop bounded by explicit limits. It matters because every later capability of the platform (tools, memory, subagents, remote agents, the tool gateway, identity and the console) is built around this one loop. Learners see why the platform uses an agent rather than a hard-coded sequence, see the target platform they will build over 12 sessions, and direct their own coding agent to build a bounded, observable single-agent runtime for a sandbox incident investigation.</w:t>
+        <w:t>This first session of "Building Agentic Platforms" opens the course: why enterprise work needs several agents working together, why that calls for a platform, and the parts of the platform learners will build over 12 sessions. It then explains how one AI agent actually works: a model proposes an action, a runtime decides whether to execute it, and a tool returns an observation, in a loop bounded by explicit limits. Every later capability (tools, memory, subagents, remote agents, the tool gateway, identity and the console) is built around this loop. In class the instructor directs a coding agent to build that bounded runtime for a sandbox incident investigation; after the session each learner repeats the same prompts in their own project.</w:t>
       </w:r>
     </w:p>
     <w:p>
@@ -490,7 +490,7 @@
         <w:rPr>
           <w:color w:val="1F4E79"/>
         </w:rPr>
-        <w:t>• Access to an AI coding agent (for example Claude Code) and a personal Git repository. No paid model account is needed: the course runs on an offline, deterministic mock provider.</w:t>
+        <w:t>• Access to an AI coding agent (for example Claude Code) and to the course GitLab group (you receive an invitation); the setup prompt installs the GitLab CLI. No paid model account is needed: the course runs on an offline, deterministic mock provider.</w:t>
       </w:r>
     </w:p>
     <w:p>
@@ -503,6 +503,18 @@
           <w:color w:val="1F4E79"/>
         </w:rPr>
         <w:t>• Local Python 3.12 environment (the coding agent installs pinned dependencies) or Docker.</w:t>
+      </w:r>
+    </w:p>
+    <w:p>
+      <w:pPr>
+        <w:spacing w:after="200" w:lineRule="auto"/>
+        <w:ind w:left="432" w:firstLine="0"/>
+      </w:pPr>
+      <w:r>
+        <w:rPr>
+          <w:color w:val="1F4E79"/>
+        </w:rPr>
+        <w:t>• None of this has to be ready for Session 01 itself: the session is a demonstration, and learners set up their project afterwards with the setup prompt.</w:t>
       </w:r>
     </w:p>
     <w:p>
@@ -633,7 +645,7 @@
           <w:bCs w:val="1"/>
           <w:rtl w:val="0"/>
         </w:rPr>
-        <w:t xml:space="preserve">Sep 22, 2026</w:t>
+        <w:t>Oct 28, 2026</w:t>
       </w:r>
       <w:r>
         <w:rPr>
@@ -686,7 +698,7 @@
         <w:rPr>
           <w:color w:val="1F4E79"/>
         </w:rPr>
-        <w:t>Draft for L&amp;D (please adjust date and link): "L3 Building Agentic Platforms, Session 01: Agent architecture and the ReAct runtime (120 min: 30 min discussion + 90 min guided build). We start the incident-investigation platform you will extend all course long. Before the session: set up your repository and coding agent, and read 'Building effective agents' and the ReAct paper. Bring a laptop with your coding agent working."</w:t>
+        <w:t>Draft for L&amp;D (please add the link): "L3 Building Agentic Platforms, Session 01: Agent architecture and the ReAct runtime (120 min: 30 min discussion + 90 min instructor demonstration). We open the course and start the incident-investigation platform you will extend all course long. Nothing to prepare: after the session you repeat the demonstrated prompts in your own project. Session page: https://maxvpavlov.github.io/ciklum-innovate-l3-2026/lesson-01/"</w:t>
       </w:r>
     </w:p>
     <w:p>
@@ -705,26 +717,7 @@
         <w:rPr>
           <w:color w:val="1F4E79"/>
         </w:rPr>
-        <w:t>120 minutes. Timing constraint: the guided build needs at least 70 uninterrupted minutes; learners need their coding agent and repository ready before the session starts.</w:t>
-      </w:r>
-    </w:p>
-    <w:p>
-      <w:pPr>
-        <w:spacing w:after="200" w:lineRule="auto"/>
-        <w:ind w:left="0" w:firstLine="0"/>
-      </w:pPr>
-      <w:r>
-        <w:rPr>
-          <w:b/>
-          <w:color w:val="1F4E79"/>
-        </w:rPr>
-        <w:t xml:space="preserve">Note for L&amp;D: </w:t>
-      </w:r>
-      <w:r>
-        <w:rPr>
-          <w:color w:val="1F4E79"/>
-        </w:rPr>
-        <w:t>this template says Sep 22, 2026, but the Selection sheet of the curriculum workbook plans the first session for 2026-10-28. Please confirm the date.</w:t>
+        <w:t>120 minutes. Timing constraint: the demonstration needs about 45 uninterrupted minutes with the session page and a terminal shared on screen. Learners need nothing installed to attend.</w:t>
       </w:r>
     </w:p>
     <w:p>
@@ -868,7 +861,7 @@
         <w:rPr>
           <w:color w:val="1F4E79"/>
         </w:rPr>
-        <w:t>Maksym Pavlov is the main speaker and SME: concept discussion, live demo of each build step, review of learners' code and evidence. Co-speakers or mentors: none named yet.</w:t>
+        <w:t>Maksym Pavlov is the main speaker and SME: the course opening and concept discussion, and the live demonstration of the setup prompt, the check pack and each build step. Learners' own code is checked after the session by the Session 01 check pack and the review prompt. Co-speakers or mentors: none named yet.</w:t>
       </w:r>
     </w:p>
     <w:p>
@@ -1046,7 +1039,7 @@
         <w:rPr>
           <w:color w:val="1F4E79"/>
         </w:rPr>
-        <w:t>Contrast a hard-coded sequence with an agent loop and explain why incident investigation needs the loop, and where its flexibility needs limits.</w:t>
+        <w:t>Explain the ReAct loop (the model reasons and proposes an action, the runtime executes it, and the observation feeds the next step) and why an incident investigation needs it rather than a hard-coded sequence.</w:t>
       </w:r>
     </w:p>
     <w:p>
@@ -1079,7 +1072,7 @@
         <w:rPr>
           <w:color w:val="1F4E79"/>
         </w:rPr>
-        <w:t>Design an application-owned run contract that separates tenant identity, permissions and limits from anything the model produces.</w:t>
+        <w:t>Build, by directing a coding agent, a ReAct runtime bounded by step, token, time and repeated-action limits.</w:t>
       </w:r>
     </w:p>
     <w:p>
@@ -1112,7 +1105,7 @@
         <w:rPr>
           <w:color w:val="1F4E79"/>
         </w:rPr>
-        <w:t>Build, by directing a coding agent, a bounded model → tool → observation loop with step, token, time and repeated-action guards.</w:t>
+        <w:t>Design a run contract in which application code, not the model, owns tenant identity, permissions and limits.</w:t>
       </w:r>
     </w:p>
     <w:p>
@@ -1145,7 +1138,7 @@
         <w:rPr>
           <w:color w:val="1F4E79"/>
         </w:rPr>
-        <w:t>Evaluate a run from its event log and structured, cited answer, distinguishing completed execution from a supported conclusion.</w:t>
+        <w:t>Evaluate a run from its event log and cited answer, distinguishing a completed run from a supported conclusion.</w:t>
       </w:r>
     </w:p>
     <w:p>
@@ -1178,7 +1171,7 @@
         <w:rPr>
           <w:color w:val="1F4E79"/>
         </w:rPr>
-        <w:t>Describe the target agentic platform (runtime, agent registry, MCP tool gateway, identity and credentials, console, operations) and locate the runtime within it.</w:t>
+        <w:t>Describe the target agentic platform (agent registry, MCP tool gateway, identity and credentials, console, operations), when a task needs more than one agent, and where the ReAct runtime sits within it.</w:t>
       </w:r>
     </w:p>
     <w:p>
@@ -1286,55 +1279,7 @@
         <w:rPr>
           <w:color w:val="1F4E79"/>
         </w:rPr>
-        <w:t>• Refresh LLM, prompting and RAG basics, plus HTTP, JSON, async programming and tests (about 1–2 hours).</w:t>
-      </w:r>
-    </w:p>
-    <w:p>
-      <w:pPr>
-        <w:spacing w:after="200" w:lineRule="auto"/>
-        <w:ind w:left="432" w:firstLine="0"/>
-      </w:pPr>
-      <w:r>
-        <w:rPr>
-          <w:color w:val="1F4E79"/>
-        </w:rPr>
-        <w:t>• Read 'Building effective agents' (Anthropic) and the ReAct paper; skim your model provider's tool-calling docs (about 1 hour).</w:t>
-      </w:r>
-    </w:p>
-    <w:p>
-      <w:pPr>
-        <w:spacing w:after="200" w:lineRule="auto"/>
-        <w:ind w:left="432" w:firstLine="0"/>
-      </w:pPr>
-      <w:r>
-        <w:rPr>
-          <w:color w:val="1F4E79"/>
-        </w:rPr>
-        <w:t>• Set up a personal Git repository and a working AI coding agent; ask it to prepare the Lesson 01 workspace from the reference repository (prompt provided in the course materials). Confirm the baseline checks run.</w:t>
-      </w:r>
-    </w:p>
-    <w:p>
-      <w:pPr>
-        <w:spacing w:after="200" w:lineRule="auto"/>
-        <w:ind w:left="432" w:firstLine="0"/>
-      </w:pPr>
-      <w:r>
-        <w:rPr>
-          <w:color w:val="1F4E79"/>
-        </w:rPr>
-        <w:t>• Write five acceptance scenarios for the sample incident.</w:t>
-      </w:r>
-    </w:p>
-    <w:p>
-      <w:pPr>
-        <w:spacing w:after="200" w:lineRule="auto"/>
-        <w:ind w:left="432" w:firstLine="0"/>
-      </w:pPr>
-      <w:r>
-        <w:rPr>
-          <w:color w:val="1F4E79"/>
-        </w:rPr>
-        <w:t>• Sketch the target platform you expect to build, labelling each component with the session that builds it.</w:t>
+        <w:t>No pre-work required. The readings and the project setup are part of the after-class work (4.4).</w:t>
       </w:r>
     </w:p>
     <w:p>
@@ -1641,7 +1586,7 @@
               <w:rPr>
                 <w:color w:val="1F4E79"/>
               </w:rPr>
-              <w:t>Opening: the incident, the target platform blueprint</w:t>
+              <w:t>Course opening: why agent teams, when to split work, why a platform and its parts, and the incident premise</w:t>
             </w:r>
           </w:p>
         </w:tc>
@@ -1666,7 +1611,7 @@
               <w:rPr>
                 <w:color w:val="1F4E79"/>
               </w:rPr>
-              <w:t>0–10 min</w:t>
+              <w:t>0–17 min</w:t>
             </w:r>
           </w:p>
         </w:tc>
@@ -1691,7 +1636,7 @@
               <w:rPr>
                 <w:color w:val="1F4E79"/>
               </w:rPr>
-              <w:t>Discussion</w:t>
+              <w:t>Presentation + discussion</w:t>
             </w:r>
           </w:p>
         </w:tc>
@@ -1748,7 +1693,7 @@
               <w:rPr>
                 <w:color w:val="1F4E79"/>
               </w:rPr>
-              <w:t>Concept: model, runtime and tools; agent vs hard-coded sequence; limits</w:t>
+              <w:t>Concept: the ReAct loop, one real run, who owns identity and limits</w:t>
             </w:r>
           </w:p>
         </w:tc>
@@ -1773,7 +1718,7 @@
               <w:rPr>
                 <w:color w:val="1F4E79"/>
               </w:rPr>
-              <w:t>10–30 min</w:t>
+              <w:t>17–30 min</w:t>
             </w:r>
           </w:p>
         </w:tc>
@@ -1855,7 +1800,7 @@
               <w:rPr>
                 <w:color w:val="1F4E79"/>
               </w:rPr>
-              <w:t>Build steps 1–2: run contract; provider adapters</w:t>
+              <w:t>Instructor demo: the setup prompt, the check pack and build steps 1–4 on a fresh project</w:t>
             </w:r>
           </w:p>
         </w:tc>
@@ -1880,7 +1825,7 @@
               <w:rPr>
                 <w:color w:val="1F4E79"/>
               </w:rPr>
-              <w:t>30–50 min</w:t>
+              <w:t>30–75 min</w:t>
             </w:r>
           </w:p>
         </w:tc>
@@ -1905,7 +1850,7 @@
               <w:rPr>
                 <w:color w:val="1F4E79"/>
               </w:rPr>
-              <w:t>Live demo + guided build</w:t>
+              <w:t>Live demo</w:t>
             </w:r>
           </w:p>
         </w:tc>
@@ -1962,7 +1907,7 @@
               <w:rPr>
                 <w:color w:val="1F4E79"/>
               </w:rPr>
-              <w:t>Build steps 3–4: the loop and pending calls; guards and evidence</w:t>
+              <w:t>Break it on purpose: learners predict each guard's failure, the instructor runs it</w:t>
             </w:r>
           </w:p>
         </w:tc>
@@ -1987,7 +1932,7 @@
               <w:rPr>
                 <w:color w:val="1F4E79"/>
               </w:rPr>
-              <w:t>50–75 min</w:t>
+              <w:t>75–95 min</w:t>
             </w:r>
           </w:p>
         </w:tc>
@@ -2012,7 +1957,7 @@
               <w:rPr>
                 <w:color w:val="1F4E79"/>
               </w:rPr>
-              <w:t>Live demo + guided build</w:t>
+              <w:t>Discussion + live demo</w:t>
             </w:r>
           </w:p>
         </w:tc>
@@ -2069,7 +2014,7 @@
               <w:rPr>
                 <w:color w:val="1F4E79"/>
               </w:rPr>
-              <w:t>Learner exercise: fault injection on limits</w:t>
+              <w:t>Verification evidence, the review prompt and pushing the checkpoint to GitLab</w:t>
             </w:r>
           </w:p>
         </w:tc>
@@ -2094,7 +2039,7 @@
               <w:rPr>
                 <w:color w:val="1F4E79"/>
               </w:rPr>
-              <w:t>75–100 min</w:t>
+              <w:t>95–110 min</w:t>
             </w:r>
           </w:p>
         </w:tc>
@@ -2119,7 +2064,7 @@
               <w:rPr>
                 <w:color w:val="1F4E79"/>
               </w:rPr>
-              <w:t>Hands-on exercise</w:t>
+              <w:t>Live demo</w:t>
             </w:r>
           </w:p>
         </w:tc>
@@ -2176,7 +2121,7 @@
               <w:rPr>
                 <w:color w:val="1F4E79"/>
               </w:rPr>
-              <w:t>Acceptance checks and interpreting results</w:t>
+              <w:t>Questions and the after-class assignment: repeat every prompt in your own project</w:t>
             </w:r>
           </w:p>
         </w:tc>
@@ -2201,7 +2146,7 @@
               <w:rPr>
                 <w:color w:val="1F4E79"/>
               </w:rPr>
-              <w:t>100–115 min</w:t>
+              <w:t>110–120 min</w:t>
             </w:r>
           </w:p>
         </w:tc>
@@ -2226,114 +2171,7 @@
               <w:rPr>
                 <w:color w:val="1F4E79"/>
               </w:rPr>
-              <w:t>Verification + discussion</w:t>
-            </w:r>
-          </w:p>
-        </w:tc>
-      </w:tr>
-      <w:tr>
-        <w:trPr>
-          <w:cantSplit w:val="0"/>
-          <w:trHeight w:val="270" w:hRule="atLeast"/>
-          <w:tblHeader w:val="0"/>
-        </w:trPr>
-        <w:tc>
-          <w:tcPr>
-            <w:tcBorders>
-              <w:top w:color="000000" w:space="0" w:sz="0" w:val="nil"/>
-              <w:left w:color="000000" w:space="0" w:sz="5" w:val="single"/>
-              <w:bottom w:color="000000" w:space="0" w:sz="5" w:val="single"/>
-              <w:right w:color="000000" w:space="0" w:sz="5" w:val="single"/>
-            </w:tcBorders>
-            <w:tcMar>
-              <w:top w:w="0.0" w:type="dxa"/>
-              <w:left w:w="100.0" w:type="dxa"/>
-              <w:bottom w:w="0.0" w:type="dxa"/>
-              <w:right w:w="100.0" w:type="dxa"/>
-            </w:tcMar>
-            <w:vAlign w:val="top"/>
-          </w:tcPr>
-          <w:p>
-            <w:r>
-              <w:rPr>
-                <w:color w:val="1F4E79"/>
-              </w:rPr>
-              <w:t>7</w:t>
-            </w:r>
-          </w:p>
-        </w:tc>
-        <w:tc>
-          <w:tcPr>
-            <w:tcBorders>
-              <w:top w:color="000000" w:space="0" w:sz="0" w:val="nil"/>
-              <w:left w:color="000000" w:space="0" w:sz="0" w:val="nil"/>
-              <w:bottom w:color="000000" w:space="0" w:sz="5" w:val="single"/>
-              <w:right w:color="000000" w:space="0" w:sz="5" w:val="single"/>
-            </w:tcBorders>
-            <w:tcMar>
-              <w:top w:w="0.0" w:type="dxa"/>
-              <w:left w:w="100.0" w:type="dxa"/>
-              <w:bottom w:w="0.0" w:type="dxa"/>
-              <w:right w:w="100.0" w:type="dxa"/>
-            </w:tcMar>
-            <w:vAlign w:val="top"/>
-          </w:tcPr>
-          <w:p>
-            <w:r>
-              <w:rPr>
-                <w:color w:val="1F4E79"/>
-              </w:rPr>
-              <w:t>Questions, reflection and checkpoint handoff</w:t>
-            </w:r>
-          </w:p>
-        </w:tc>
-        <w:tc>
-          <w:tcPr>
-            <w:tcBorders>
-              <w:top w:color="000000" w:space="0" w:sz="0" w:val="nil"/>
-              <w:left w:color="000000" w:space="0" w:sz="0" w:val="nil"/>
-              <w:bottom w:color="000000" w:space="0" w:sz="5" w:val="single"/>
-              <w:right w:color="000000" w:space="0" w:sz="5" w:val="single"/>
-            </w:tcBorders>
-            <w:tcMar>
-              <w:top w:w="0.0" w:type="dxa"/>
-              <w:left w:w="100.0" w:type="dxa"/>
-              <w:bottom w:w="0.0" w:type="dxa"/>
-              <w:right w:w="100.0" w:type="dxa"/>
-            </w:tcMar>
-            <w:vAlign w:val="top"/>
-          </w:tcPr>
-          <w:p>
-            <w:r>
-              <w:rPr>
-                <w:color w:val="1F4E79"/>
-              </w:rPr>
-              <w:t>115–120 min</w:t>
-            </w:r>
-          </w:p>
-        </w:tc>
-        <w:tc>
-          <w:tcPr>
-            <w:tcBorders>
-              <w:top w:color="000000" w:space="0" w:sz="0" w:val="nil"/>
-              <w:left w:color="000000" w:space="0" w:sz="0" w:val="nil"/>
-              <w:bottom w:color="000000" w:space="0" w:sz="5" w:val="single"/>
-              <w:right w:color="000000" w:space="0" w:sz="5" w:val="single"/>
-            </w:tcBorders>
-            <w:tcMar>
-              <w:top w:w="0.0" w:type="dxa"/>
-              <w:left w:w="100.0" w:type="dxa"/>
-              <w:bottom w:w="0.0" w:type="dxa"/>
-              <w:right w:w="100.0" w:type="dxa"/>
-            </w:tcMar>
-            <w:vAlign w:val="top"/>
-          </w:tcPr>
-          <w:p>
-            <w:r>
-              <w:rPr>
-                <w:color w:val="1F4E79"/>
-              </w:rPr>
-              <w:t>Reflection</w:t>
+              <w:t>Discussion</w:t>
             </w:r>
           </w:p>
         </w:tc>
@@ -2474,7 +2312,7 @@
         <w:rPr>
           <w:color w:val="1F4E79"/>
         </w:rPr>
-        <w:t>From hard-coded sequences to agents, and the platform we will build</w:t>
+        <w:t>Why agentic platforms, and the investigation premise</w:t>
       </w:r>
     </w:p>
     <w:p>
@@ -2493,7 +2331,7 @@
         <w:rPr>
           <w:color w:val="1F4E79"/>
         </w:rPr>
-        <w:t>a hard-coded sequence prescribes steps in advance; an agent chooses the next permitted action from observations. An agentic platform wraps the agent runtime with an agent registry, an MCP tool gateway, identity and delegated credentials, a web console and operations. Today builds only the runtime at the centre.</w:t>
+        <w:t>single agents are everyday tools, while enterprise work needs agents that work together: when the work outgrows one context, is better done in a clean context, needs a different model per sub-task, or needs access isolated to one system or person. A platform spawns, configures, hosts and governs those agents and adds the control points: who called what, on whose behalf, when a run stops, whether version 2 is better, how agents work together and what actually happened. The course builds one: an incident-investigation platform for two fictional companies, Astro and Locomotive.</w:t>
       </w:r>
     </w:p>
     <w:p>
@@ -2512,7 +2350,7 @@
         <w:rPr>
           <w:color w:val="1F4E79"/>
         </w:rPr>
-        <w:t>an agent is always better than a hard-coded sequence (measure every change against a baseline on the same cases); a fluent answer is a successful investigation (success needs a cause, cited evidence, or an explicit insufficient-evidence result).</w:t>
+        <w:t>more agents are always better (each one adds cost, latency and failure modes and has to earn its place); a platform is only infrastructure (it is where identity, policy, evaluation and audit live).</w:t>
       </w:r>
     </w:p>
     <w:p>
@@ -2531,7 +2369,7 @@
         <w:rPr>
           <w:color w:val="1F4E79"/>
         </w:rPr>
-        <w:t>the runtime is the core every later platform component wraps, so its contracts and events must be explicit.</w:t>
+        <w:t>a platform is the natural next step for agentic applications; today we build its core, the agent runtime, whose contracts and events every later component relies on.</w:t>
       </w:r>
     </w:p>
     <w:p>
@@ -2564,7 +2402,7 @@
         <w:rPr>
           <w:color w:val="1F4E79"/>
         </w:rPr>
-        <w:t>The run contract and model access</w:t>
+        <w:t>The ReAct loop and the run contract</w:t>
       </w:r>
     </w:p>
     <w:p>
@@ -2583,7 +2421,7 @@
         <w:rPr>
           <w:color w:val="1F4E79"/>
         </w:rPr>
-        <w:t>Context (tenant, role, permitted tools, run id) is owned by application code; Run holds messages, events and the answer; Limits bound steps, tokens, elapsed time and output size. Provider adapters normalize OpenAI-compatible and Anthropic responses into one Reply; a deterministic mock provider makes behaviour reproducible without credentials.</w:t>
+        <w:t>the ReAct loop: the model reasons and proposes an action, the runtime decides whether and how to execute it, and the observation feeds the next step. An AI investigation platform is worth building where incidents are too varied to follow a hard-coded sequence. Context (tenant, role, permitted tools, run id) is owned by application code; Run holds messages, events and the answer; Limits bound steps, tokens, elapsed time and output size. Provider adapters normalize OpenAI-compatible and Anthropic responses into one Reply; a deterministic mock provider makes behaviour reproducible without credentials.</w:t>
       </w:r>
     </w:p>
     <w:p>
@@ -2602,7 +2440,7 @@
         <w:rPr>
           <w:color w:val="1F4E79"/>
         </w:rPr>
-        <w:t>the model can be trusted to state its own permissions; a passing offline test proves live-model quality; zero configured price means a provider is free.</w:t>
+        <w:t>an agent is always better than a hard-coded sequence (measure every change against a baseline on the same cases); the model can be trusted to state its own permissions; a passing offline test proves live-model quality; zero configured price means a provider is free.</w:t>
       </w:r>
     </w:p>
     <w:p>
@@ -2692,7 +2530,7 @@
         <w:rPr>
           <w:color w:val="1F4E79"/>
         </w:rPr>
-        <w:t>a completed run means the incident is solved; a coding agent's 'done' message is evidence; a timeout can be enforced by instructing the model.</w:t>
+        <w:t>a fluent answer is a successful investigation (success needs a cause, cited evidence, or an explicit insufficient-evidence result); a completed run means the incident is solved; a coding agent's 'done' message is evidence; a timeout can be enforced by instructing the model.</w:t>
       </w:r>
     </w:p>
     <w:p>
@@ -2822,14 +2660,13 @@
         <w:rPr>
           <w:rtl w:val="0"/>
         </w:rPr>
-        <w:t xml:space="preserve">Discussion</w:t>
+        <w:t>Discussion  ✔ (opening) What must a successful investigation contain? (75–95 min) Predict each guard's failure before it runs.</w:t>
       </w:r>
       <w:r>
         <w:rPr>
           <w:b/>
           <w:color w:val="1F4E79"/>
         </w:rPr>
-        <w:t xml:space="preserve">  ✔ (opening) What must a successful investigation contain?</w:t>
       </w:r>
     </w:p>
     <w:p>
@@ -2901,14 +2738,13 @@
         <w:rPr>
           <w:rtl w:val="0"/>
         </w:rPr>
-        <w:t xml:space="preserve">Hands-on exercise</w:t>
+        <w:t>Hands-on exercise  ✔ (after the session) Repeat the demonstrated prompts and the fault-injection exercise in your own project</w:t>
       </w:r>
       <w:r>
         <w:rPr>
           <w:b/>
           <w:color w:val="1F4E79"/>
         </w:rPr>
-        <w:t xml:space="preserve">  ✔ (75–100 min) Fault injection on runtime limits</w:t>
       </w:r>
     </w:p>
     <w:p>
@@ -2926,14 +2762,13 @@
         <w:rPr>
           <w:rtl w:val="0"/>
         </w:rPr>
-        <w:t xml:space="preserve">Live demo</w:t>
+        <w:t>Live demo  ✔ (30–75 min) The instructor runs the setup prompt, adds the check pack and demonstrates each bounded build step</w:t>
       </w:r>
       <w:r>
         <w:rPr>
           <w:b/>
           <w:color w:val="1F4E79"/>
         </w:rPr>
-        <w:t xml:space="preserve">  ✔ (build steps 1–4) Instructor demonstrates each bounded change and its checks</w:t>
       </w:r>
     </w:p>
     <w:p>
@@ -3076,13 +2911,13 @@
           <w:b/>
           <w:color w:val="1F4E79"/>
         </w:rPr>
-        <w:t xml:space="preserve">3. Live demo with guided build (4 steps). </w:t>
-      </w:r>
-      <w:r>
-        <w:rPr>
-          <w:color w:val="1F4E79"/>
-        </w:rPr>
-        <w:t>Purpose: show each bounded change. Instructions: for each step the instructor explains, shows the prompt learners give their coding agent, then compares the agent's change with the reference excerpt. Time: 45 min. Expected outcome: a working bounded runtime in each learner's repository. Debrief: ask each learner to explain one boundary in their agent's change.</w:t>
+        <w:t xml:space="preserve">3. Live demo: setup and the four build steps. </w:t>
+      </w:r>
+      <w:r>
+        <w:rPr>
+          <w:color w:val="1F4E79"/>
+        </w:rPr>
+        <w:t>Purpose: show the way of working that learners repeat after the session. Instructions: the instructor runs the setup prompt on a fresh project and adds the Session 01 check pack, then for each build step explains it, runs the prompt, and reviews the agent's change and the checks against the code excerpt on the session page. Time: 45 min. Expected outcome: learners can name each prompt, what it changes and what evidence it should produce. Debrief: ask learners to explain one boundary in the agent's change.</w:t>
       </w:r>
     </w:p>
     <w:p>
@@ -3114,13 +2949,13 @@
           <w:b/>
           <w:color w:val="1F4E79"/>
         </w:rPr>
-        <w:t xml:space="preserve">5. Hands-on exercise: fault injection. </w:t>
-      </w:r>
-      <w:r>
-        <w:rPr>
-          <w:color w:val="1F4E79"/>
-        </w:rPr>
-        <w:t>Purpose: make every stop condition observable. Instructions: in a local invocation allow one step, then a tiny token budget, then a short deadline with a slow mock provider; predict each failure first. Time: 25 min. Expected outcome: step_budget, token_budget and TimeoutError observed, then the normal cited answer restored. Debrief: compare predictions with observations and explain discrepancies.</w:t>
+        <w:t xml:space="preserve">5. Discussion: break it on purpose. </w:t>
+      </w:r>
+      <w:r>
+        <w:rPr>
+          <w:color w:val="1F4E79"/>
+        </w:rPr>
+        <w:t>Purpose: make every stop condition observable. Instructions: for each change (one step, a tiny token budget, a short deadline with a slow mock provider, a repeating provider) learners predict the failure, then the instructor runs it. Time: 20 min. Expected outcome: step_budget, token_budget, TimeoutError and repeated_action observed, then the normal cited answer restored. Debrief: compare predictions with observations and explain discrepancies. Learners repeat the exercise in their own project after the session.</w:t>
       </w:r>
     </w:p>
     <w:p>
@@ -3240,7 +3075,7 @@
         <w:rPr>
           <w:color w:val="1F4E79"/>
         </w:rPr>
-        <w:t>Extend your Session 01 checkpoint with one new acceptance scenario and a comparison with a hard-coded sequence.</w:t>
+        <w:t>Repeat today's prompts in your own project, then extend it.</w:t>
       </w:r>
     </w:p>
     <w:p>
@@ -3273,7 +3108,7 @@
         <w:rPr>
           <w:color w:val="1F4E79"/>
         </w:rPr>
-        <w:t>• Ask your coding agent to add a missing-incident scenario (for example INC-404) and define what a supported insufficient_evidence answer looks like.</w:t>
+        <w:t>• Run the prompts on the Session 01 page in order: the setup prompt (it clones the course repository, creates your project from the learner kit and pushes it to a new private repository in the course GitLab group), Add the check pack, Build steps 1–4, the exercise, Verify and push, and Review.</w:t>
       </w:r>
     </w:p>
     <w:p>
@@ -3285,7 +3120,7 @@
         <w:rPr>
           <w:color w:val="1F4E79"/>
         </w:rPr>
-        <w:t>• Write INC-001's investigation as a hard-coded sequence and run it and the agent loop on all three tickets; record step counts, stop reasons and error handling.</w:t>
+        <w:t>• Read each change before running the next prompt. The check pack must pass unchanged; never edit it to get a pass.</w:t>
       </w:r>
     </w:p>
     <w:p>
@@ -3297,19 +3132,43 @@
         <w:rPr>
           <w:color w:val="1F4E79"/>
         </w:rPr>
+        <w:t>• Read 'Building effective agents' (Anthropic) and the ReAct paper (about 1 hour).</w:t>
+      </w:r>
+    </w:p>
+    <w:p>
+      <w:pPr>
+        <w:spacing w:after="200" w:lineRule="auto"/>
+        <w:ind w:left="432" w:firstLine="0"/>
+      </w:pPr>
+      <w:r>
+        <w:rPr>
+          <w:color w:val="1F4E79"/>
+        </w:rPr>
+        <w:t>• Extension: ask your coding agent to add a missing-incident scenario (for example INC-404) and define what a supported insufficient_evidence answer looks like.</w:t>
+      </w:r>
+    </w:p>
+    <w:p>
+      <w:pPr>
+        <w:spacing w:after="200" w:lineRule="auto"/>
+        <w:ind w:left="432" w:firstLine="0"/>
+      </w:pPr>
+      <w:r>
+        <w:rPr>
+          <w:color w:val="1F4E79"/>
+        </w:rPr>
+        <w:t>• Extension: write INC-001's investigation as a hard-coded sequence and run it and the agent loop on all three tickets; record step counts, stop reasons and error handling.</w:t>
+      </w:r>
+    </w:p>
+    <w:p>
+      <w:pPr>
+        <w:spacing w:after="200" w:lineRule="auto"/>
+        <w:ind w:left="432" w:firstLine="0"/>
+      </w:pPr>
+      <w:r>
+        <w:rPr>
+          <w:color w:val="1F4E79"/>
+        </w:rPr>
         <w:t>• Redraw the platform blueprint and note which later console views the event log can already feed.</w:t>
-      </w:r>
-    </w:p>
-    <w:p>
-      <w:pPr>
-        <w:spacing w:after="200" w:lineRule="auto"/>
-        <w:ind w:left="432" w:firstLine="0"/>
-      </w:pPr>
-      <w:r>
-        <w:rPr>
-          <w:color w:val="1F4E79"/>
-        </w:rPr>
-        <w:t>• Have the agent run the full test suite and save a recoverable checkpoint; keep the actual output as evidence.</w:t>
       </w:r>
     </w:p>
     <w:p>
@@ -3342,7 +3201,7 @@
         <w:rPr>
           <w:color w:val="1F4E79"/>
         </w:rPr>
-        <w:t>A committed checkpoint with the new scenario and passing checks (7 tests at the reference checkpoint), a short comparison table, and an updated blueprint sketch.</w:t>
+        <w:t>Your project in the course GitLab group with the Lesson 01 check pack passing unchanged (7 tests) and LESSON = 1, plus a short comparison table and an updated blueprint sketch. Estimated time: 2–3 hours.</w:t>
       </w:r>
     </w:p>
     <w:p>
@@ -3527,7 +3386,7 @@
         <w:rPr>
           <w:color w:val="1F4E79"/>
         </w:rPr>
-        <w:t>Draft outline (Context → Concept → Example → Application → Practice → Summary). The full instructor script is in instructor guide 01 (instructor-guides/01 Agent architecture and the ReAct runtime.docx).</w:t>
+        <w:t>The Session 01 page is the presentation, with Read and Present views (https://maxvpavlov.github.io/ciklum-innovate-l3-2026/lesson-01/). The full instructor script is in instructor guide 01. Outline (Context → Concept → Example → Application → Practice → Summary):</w:t>
       </w:r>
     </w:p>
     <w:p>
@@ -3551,7 +3410,7 @@
         <w:rPr>
           <w:color w:val="1F4E79"/>
         </w:rPr>
-        <w:t>• 2. Context: the sandbox incident (payments slow after deploy d42) and what 'solved' means.</w:t>
+        <w:t>• 2. Why agent teams: single agents are everyday tools; enterprise work needs orchestrated agents.</w:t>
       </w:r>
     </w:p>
     <w:p>
@@ -3563,7 +3422,7 @@
         <w:rPr>
           <w:color w:val="1F4E79"/>
         </w:rPr>
-        <w:t>• 3. The target platform blueprint: runtime, registry, tool gateway, identity, console, operations; session map.</w:t>
+        <w:t>• 3. When to split the work across agents: context size, a clean context, a model per sub-task, isolated access.</w:t>
       </w:r>
     </w:p>
     <w:p>
@@ -3575,7 +3434,7 @@
         <w:rPr>
           <w:color w:val="1F4E79"/>
         </w:rPr>
-        <w:t>• 4. Concept: agent vs hard-coded sequence; model, runtime and tools as three boxes.</w:t>
+        <w:t>• 4. Why a platform, and its parts: the control points and the map of what the course builds.</w:t>
       </w:r>
     </w:p>
     <w:p>
@@ -3587,7 +3446,7 @@
         <w:rPr>
           <w:color w:val="1F4E79"/>
         </w:rPr>
-        <w:t>• 5. Concept: the run contract (Context, Run, Limits) and who owns each field.</w:t>
+        <w:t>• 5. How we work: coding agents, checkpoints, evidence over claims, offline synthetic data.</w:t>
       </w:r>
     </w:p>
     <w:p>
@@ -3599,7 +3458,7 @@
         <w:rPr>
           <w:color w:val="1F4E79"/>
         </w:rPr>
-        <w:t>• 6. Concept: provider adapters and the deterministic mock provider.</w:t>
+        <w:t>• 6. The premise: the incident-investigation platform, Astro's tickets, what a runbook is, and INC-001.</w:t>
       </w:r>
     </w:p>
     <w:p>
@@ -3611,7 +3470,7 @@
         <w:rPr>
           <w:color w:val="1F4E79"/>
         </w:rPr>
-        <w:t>• 7. Example: one iteration for INC-001, from tool call to observation.</w:t>
+        <w:t>• 7. Concept: the ReAct loop as three boxes, and why an agent rather than a hard-coded sequence.</w:t>
       </w:r>
     </w:p>
     <w:p>
@@ -3623,7 +3482,7 @@
         <w:rPr>
           <w:color w:val="1F4E79"/>
         </w:rPr>
-        <w:t>• 8. Example: guards and their failure codes.</w:t>
+        <w:t>• 8. Example: one real run of INC-001, step by step.</w:t>
       </w:r>
     </w:p>
     <w:p>
@@ -3635,7 +3494,7 @@
         <w:rPr>
           <w:color w:val="1F4E79"/>
         </w:rPr>
-        <w:t>• 9. Application: the four build prompts learners give their coding agent.</w:t>
+        <w:t>• 9. Concept: who owns identity and limits; the four guards.</w:t>
       </w:r>
     </w:p>
     <w:p>
@@ -3647,7 +3506,7 @@
         <w:rPr>
           <w:color w:val="1F4E79"/>
         </w:rPr>
-        <w:t>• 10. Practice: fault-injection exercise and acceptance checks.</w:t>
+        <w:t>• 10. Application: the setup prompt, the check pack and the four build prompts.</w:t>
       </w:r>
     </w:p>
     <w:p>
@@ -3659,7 +3518,7 @@
         <w:rPr>
           <w:color w:val="1F4E79"/>
         </w:rPr>
-        <w:t>• 11. Evidence, not claims: reading the event log and test output.</w:t>
+        <w:t>• 11. Practice: break it on purpose, then verification evidence and the push to GitLab.</w:t>
       </w:r>
     </w:p>
     <w:p>
@@ -3671,7 +3530,7 @@
         <w:rPr>
           <w:color w:val="1F4E79"/>
         </w:rPr>
-        <w:t>• 12. Summary, reflection questions and what comes next.</w:t>
+        <w:t>• 12. Summary and the after-class assignment.</w:t>
       </w:r>
     </w:p>
     <w:p>
@@ -3799,7 +3658,7 @@
         <w:rPr>
           <w:color w:val="1F4E79"/>
         </w:rPr>
-        <w:t>An agent is a loop: the model proposes, the runtime decides and executes, the tool observes.</w:t>
+        <w:t>An agent is a ReAct loop: the model reasons and proposes, the runtime decides and executes, the tool returns an observation.</w:t>
       </w:r>
     </w:p>
     <w:p>
@@ -4212,7 +4071,7 @@
         <w:rPr>
           <w:color w:val="1F4E79"/>
         </w:rPr>
-        <w:t>Session 02, Reliable tools and MCP integration (120 min): validated tool contracts, application-owned permissions, an approval gate for mock remediation and real MCP transport. Bring your Session 01 checkpoint.</w:t>
+        <w:t>Session 02, Reliable tools and MCP integration (120 min): validated tool contracts, application-owned permissions, an approval gate for mock remediation and real MCP transport. It starts from your Session 01 checkpoint in your GitLab repository.</w:t>
       </w:r>
     </w:p>
     <w:p>
@@ -4466,7 +4325,7 @@
         <w:rPr>
           <w:color w:val="1F4E79"/>
         </w:rPr>
-        <w:t>• Video 1 (5 min): what an agent is, agent vs hard-coded sequence, and the platform blueprint.</w:t>
+        <w:t>• Video 1 (5 min): why agent teams need a platform, what an agent is, agent vs hard-coded sequence, and the platform blueprint.</w:t>
       </w:r>
     </w:p>
     <w:p>
@@ -4526,7 +4385,7 @@
         <w:rPr>
           <w:color w:val="1F4E79"/>
         </w:rPr>
-        <w:t>Source material: instructor guide 01 (SAY sections), the reference repository at tag lesson-01 and its lab output.</w:t>
+        <w:t>Source material: the Session 01 page (https://maxvpavlov.github.io/ciklum-innovate-l3-2026/lesson-01/), instructor guide 01 (SAY sections) and the lesson-01 lab output.</w:t>
       </w:r>
     </w:p>
     <w:p>
@@ -4965,7 +4824,7 @@
         <w:rPr>
           <w:color w:val="1F4E79"/>
         </w:rPr>
-        <w:t>Using your own coding agent and the course reference repository, build the Session 01 checkpoint: a bounded single-agent runtime for the sample incident.</w:t>
+        <w:t>Using your own coding agent and the learner kit in the course repository, build the Session 01 checkpoint: a bounded single-agent runtime for the sample incident.</w:t>
       </w:r>
     </w:p>
     <w:p>
@@ -4984,7 +4843,7 @@
         <w:rPr>
           <w:color w:val="1F4E79"/>
         </w:rPr>
-        <w:t>The four build prompts and the verification prompt are in LEARNER_PROMPTS.md (Lesson 01); no paid model account is needed.</w:t>
+        <w:t>Run the prompts on the Session 01 page in order, starting with the setup prompt, which creates your project and its repository in the course GitLab group; the same prompts are in LEARNER_PROMPTS.md (Lesson 01). No paid model account is needed.</w:t>
       </w:r>
     </w:p>
     <w:p>
@@ -5003,7 +4862,7 @@
         <w:rPr>
           <w:color w:val="1F4E79"/>
         </w:rPr>
-        <w:t>a repository whose Lesson 01 tests pass, the lab output for INC-001 citing log-astro-001 and rb-pool-v1, and a short note explaining each guard you triggered.</w:t>
+        <w:t>your repository in the course GitLab group with the Lesson 01 check pack passing unchanged (7 tests), the lab output for INC-001 citing log-astro-001 and rb-pool-v1, and a short note explaining each guard you triggered.</w:t>
       </w:r>
     </w:p>
     <w:p>
@@ -5060,7 +4919,7 @@
         <w:rPr>
           <w:color w:val="1F4E79"/>
         </w:rPr>
-        <w:t>instructor guide 01, LEARNER_PROMPTS.md, reference tag lesson-01.</w:t>
+        <w:t>the Session 01 page, learner-kit/lessons/01 in the course repository, LEARNER_PROMPTS.md (Lesson 01).</w:t>
       </w:r>
     </w:p>
     <w:p>
@@ -5326,7 +5185,7 @@
         <w:rPr>
           <w:color w:val="1F4E79"/>
         </w:rPr>
-        <w:t>the reference repository at tag lesson-01 (incident/core.py, incident/providers.py) and TESTING.md.</w:t>
+        <w:t>one finished implementation, the course reference at tag lesson-01 (incident/core.py, incident/providers.py) and TESTING.md; read it after building your own.</w:t>
       </w:r>
     </w:p>
     <w:p>
@@ -5506,14 +5365,13 @@
         <w:rPr>
           <w:rtl w:val="0"/>
         </w:rPr>
-        <w:t xml:space="preserve">Presentation</w:t>
+        <w:t>Presentation  ✔ the Session 01 page (https://maxvpavlov.github.io/ciklum-innovate-l3-2026/lesson-01/), with Read and Present views</w:t>
       </w:r>
       <w:r>
         <w:rPr>
           <w:b/>
           <w:color w:val="1F4E79"/>
         </w:rPr>
-        <w:t xml:space="preserve">  ✔ outline in 5.1; slides to be produced</w:t>
       </w:r>
     </w:p>
     <w:p>
@@ -5614,14 +5472,13 @@
         <w:rPr>
           <w:rtl w:val="0"/>
         </w:rPr>
-        <w:t xml:space="preserve">Demo</w:t>
+        <w:t>Demo  ✔ the learner kit (learner-kit/ in the course repository); the reference tags lesson-00 → lesson-01 are the instructor's answer key</w:t>
       </w:r>
       <w:r>
         <w:rPr>
           <w:b/>
           <w:color w:val="1F4E79"/>
         </w:rPr>
-        <w:t xml:space="preserve">  ✔ reference repository, tags lesson-00 → lesson-01</w:t>
       </w:r>
     </w:p>
     <w:p>
@@ -5653,14 +5510,13 @@
         <w:rPr>
           <w:rtl w:val="0"/>
         </w:rPr>
-        <w:t xml:space="preserve">Diagrams</w:t>
+        <w:t>Diagrams  ✔ the orchestration, platform blueprint and ReAct loop diagrams on the Session 01 page</w:t>
       </w:r>
       <w:r>
         <w:rPr>
           <w:b/>
           <w:color w:val="1F4E79"/>
         </w:rPr>
-        <w:t xml:space="preserve">  ✔ platform blueprint (drawn live; a slide version is still to be produced)</w:t>
       </w:r>
     </w:p>
     <w:p>
@@ -5692,14 +5548,13 @@
         <w:rPr>
           <w:rtl w:val="0"/>
         </w:rPr>
-        <w:t xml:space="preserve">Sample files</w:t>
+        <w:t>Sample files  ✔ synthetic incidents and runbooks in learner-kit/lessons/01/given</w:t>
       </w:r>
       <w:r>
         <w:rPr>
           <w:b/>
           <w:color w:val="1F4E79"/>
         </w:rPr>
-        <w:t xml:space="preserve">  ✔ synthetic incidents and runbooks in the reference repository</w:t>
       </w:r>
     </w:p>
     <w:p>
@@ -5984,7 +5839,31 @@
         <w:rPr>
           <w:color w:val="1F4E79"/>
         </w:rPr>
-        <w:t>• Checkpoint: a reference repository tag (lesson-NN) marking the end state of a session.</w:t>
+        <w:t>• Checkpoint: the tagged state of a learner's project at the end of a session. The course's own lesson-NN tags are the instructor's answer key.</w:t>
+      </w:r>
+    </w:p>
+    <w:p>
+      <w:pPr>
+        <w:spacing w:after="200" w:lineRule="auto"/>
+        <w:ind w:left="432" w:firstLine="0"/>
+      </w:pPr>
+      <w:r>
+        <w:rPr>
+          <w:color w:val="1F4E79"/>
+        </w:rPr>
+        <w:t>• Learner kit and check pack: the starter project, the given files and each lesson's tests, in learner-kit/ of the course repository; a lesson's check pack fails until its capability is built.</w:t>
+      </w:r>
+    </w:p>
+    <w:p>
+      <w:pPr>
+        <w:spacing w:after="200" w:lineRule="auto"/>
+        <w:ind w:left="432" w:firstLine="0"/>
+      </w:pPr>
+      <w:r>
+        <w:rPr>
+          <w:color w:val="1F4E79"/>
+        </w:rPr>
+        <w:t>• Given files: synthetic data and deterministic test doubles, such as the mock provider, that everyone uses unchanged.</w:t>
       </w:r>
     </w:p>
     <w:p>
@@ -6306,7 +6185,7 @@
         <w:rPr>
           <w:color w:val="1F4E79"/>
         </w:rPr>
-        <w:t>• Learners write prompts for their coding agent rather than typing code; the reference excerpts are for review, not copying.</w:t>
+        <w:t>• Learners write prompts for their coding agent rather than typing code. The code excerpts on the session page show one way to write it; the check pack, not a comparison with the reference, proves a learner's own implementation.</w:t>
       </w:r>
     </w:p>
     <w:p>

</xml_diff>

<commit_message>
Session dates: Session 01 on Oct 21, Session 02 on Oct 28, 2026; drop calendar-link requests
Co-Authored-By: Claude Opus 5.5 <noreply@anthropic.com>
Claude-Session: https://claude.ai/code/session_0123W63ZaDAAnYHCFqarTnbL
</commit_message>
<xml_diff>
--- a/L3 2026 Agentic Platform Instructor Materials/content-development/01 Agent architecture and the ReAct runtime - content development.docx
+++ b/L3 2026 Agentic Platform Instructor Materials/content-development/01 Agent architecture and the ReAct runtime - content development.docx
@@ -641,11 +641,11 @@
       </w:r>
       <w:r>
         <w:rPr>
-          <w:b w:val="1"/>
-          <w:bCs w:val="1"/>
-          <w:rtl w:val="0"/>
-        </w:rPr>
-        <w:t>Oct 28, 2026</w:t>
+          <w:b/>
+          <w:bCs w:val="1"/>
+          <w:rtl w:val="0"/>
+        </w:rPr>
+        <w:t>Oct 21, 2026</w:t>
       </w:r>
       <w:r>
         <w:rPr>
@@ -698,7 +698,7 @@
         <w:rPr>
           <w:color w:val="1F4E79"/>
         </w:rPr>
-        <w:t>Draft for L&amp;D (please add the link): "L3 Building Agentic Platforms, Session 01: Agent architecture and the ReAct runtime (120 min: 30 min discussion + 90 min instructor demonstration). We open the course and start the incident-investigation platform you will extend all course long. Nothing to prepare: after the session you repeat the demonstrated prompts in your own project. Session page: https://maxvpavlov.github.io/ciklum-innovate-l3-2026/lesson-01/"</w:t>
+        <w:t>Draft for L&amp;D: "L3 Building Agentic Platforms, Session 01: Agent architecture and the ReAct runtime, Oct 21, 2026 (120 min: 30 min discussion + 90 min instructor demonstration). We open the course and start the incident-investigation platform you will extend all course long. Nothing to prepare: after the session you repeat the demonstrated prompts in your own project. Session page: https://maxvpavlov.github.io/ciklum-innovate-l3-2026/lesson-01/"</w:t>
       </w:r>
     </w:p>
     <w:p>

</xml_diff>